<commit_message>
Link deployed WebGL reviewer build
</commit_message>
<xml_diff>
--- a/docs/paper/word/00_All_author_note_replacements.docx
+++ b/docs/paper/word/00_All_author_note_replacements.docx
@@ -5723,7 +5723,7 @@
     </w:p>
     <w:p>
       <w:r>
-        <w:t>Pseudocode for CEID and the Unity digital-twin workflow, together with the sanitized closed-loop trace, target spectrum, gravimetric validation data, and manuscript-supporting files, is available at https://github.com/souhilsid/Self-Driving-Lab-Digital-Twin- under the MIT License. A versioned archival release of these materials will be deposited in Zenodo upon acceptance; the corresponding DOI will be added to the final manuscript. CEID implementation source, Unity implementation source, and the physical hardware implementation are not publicly distributed. Access for verification or non-commercial research may be requested from AISCIA Informatics through the corresponding author and is subject to approval and an appropriate access agreement. A browser-based WebGL build of the digital twin will be supplied to reviewers through a private reviewer-accessible link after deployment and independent testing.</w:t>
+        <w:t>Pseudocode for CEID and the Unity digital-twin workflow, together with the sanitized closed-loop trace, target spectrum, gravimetric validation data, and manuscript-supporting files, is available at https://github.com/souhilsid/Self-Driving-Lab-Digital-Twin- under the MIT License. A versioned archival release of these materials will be deposited in Zenodo upon acceptance; the corresponding DOI will be added to the final manuscript. CEID implementation source, Unity implementation source, and the physical hardware implementation are not publicly distributed. Access for verification or non-commercial research may be requested from AISCIA Informatics through the corresponding author and is subject to approval and an appropriate access agreement. A browser-based WebGL build of the digital twin is available at https://souhilsid.github.io/Self-Driving-Lab-Digital-Twin-/.</w:t>
       </w:r>
     </w:p>
     <w:p>
@@ -5925,7 +5925,7 @@
                 <w:b w:val="0"/>
                 <w:sz w:val="17"/>
               </w:rPr>
-              <w:t>[INSERT ANONYMOUS REVIEWER URL]</w:t>
+              <w:t>https://souhilsid.github.io/Self-Driving-Lab-Digital-Twin-/ (no access code required)</w:t>
             </w:r>
           </w:p>
         </w:tc>
@@ -6054,25 +6054,23 @@
         <w:pStyle w:val="Heading1"/>
       </w:pPr>
       <w:r>
-        <w:t>Replacement text after deployment</w:t>
+        <w:t>Replacement text</w:t>
       </w:r>
     </w:p>
     <w:p>
       <w:r>
-        <w:t>A reviewer-accessible binary of the digital twin is available as a browser-based WebGL build at [REVIEWER URL]. No installation is required. Reviewers can open the URL in a WebGL-compatible desktop browser and use [ACCESS CODE, IF APPLICABLE]. The demonstration includes the digital-twin interface and a representative closed-loop workflow but does not provide unrestricted access to the proprietary CEID service or physical robotic hardware. Requests for supervised access to those components may be directed to [CONTACT EMAIL].</w:t>
+        <w:t>A reviewer-accessible binary of the digital twin is available as a browser-based WebGL build at https://souhilsid.github.io/Self-Driving-Lab-Digital-Twin-/. No installation or access code is required. Reviewers can open the URL in a WebGL-compatible desktop browser. The demonstration includes the digital-twin interface and a representative closed-loop workflow but does not provide unrestricted access to the proprietary CEID service or physical robotic hardware. Requests for supervised access to those components may be directed to [CONTACT EMAIL].</w:t>
       </w:r>
     </w:p>
     <w:p>
-      <w:pPr>
-        <w:spacing w:before="80" w:after="160"/>
-        <w:ind w:left="360" w:right="360"/>
-        <w:shd w:fill="FFF2CC"/>
-      </w:pPr>
       <w:r>
         <w:rPr>
           <w:b/>
         </w:rPr>
-        <w:t>STATUS: PENDING. Do not replace the manuscript's author note with the paragraph above until the WebGL URL has been deployed and independently tested.</w:t>
+        <w:t xml:space="preserve">Status: </w:t>
+      </w:r>
+      <w:r>
+        <w:t>Deployed and browser-smoke-tested on 2 July 2026.</w:t>
       </w:r>
     </w:p>
     <w:p>

</xml_diff>

<commit_message>
Document archived WebGL build access
</commit_message>
<xml_diff>
--- a/docs/paper/word/00_All_author_note_replacements.docx
+++ b/docs/paper/word/00_All_author_note_replacements.docx
@@ -5723,7 +5723,7 @@
     </w:p>
     <w:p>
       <w:r>
-        <w:t>Pseudocode for CEID and the Unity digital-twin workflow, together with the sanitized closed-loop trace, target spectrum, gravimetric validation data, and manuscript-supporting files, is available at https://github.com/souhilsid/Self-Driving-Lab-Digital-Twin- under the MIT License. A versioned archival release of these materials will be deposited in Zenodo upon acceptance; the corresponding DOI will be added to the final manuscript. CEID implementation source, Unity implementation source, and the physical hardware implementation are not publicly distributed. Access for verification or non-commercial research may be requested from AISCIA Informatics through the corresponding author and is subject to approval and an appropriate access agreement. A browser-based WebGL build of the digital twin is available at https://souhilsid.github.io/Self-Driving-Lab-Digital-Twin-/.</w:t>
+        <w:t>Pseudocode for CEID and the Unity digital-twin workflow, together with the sanitized closed-loop trace, target spectrum, gravimetric validation data, manuscript-supporting files, and an archived Unity WebGL build folder, is available at https://github.com/souhilsid/Self-Driving-Lab-Digital-Twin- under the MIT License. A versioned archival release of these materials will be deposited in Zenodo upon acceptance; the corresponding DOI will be added to the final manuscript. CEID implementation source, Unity implementation source, and the physical hardware implementation are not publicly distributed. Access for verification or non-commercial research may be requested from AISCIA Informatics through the corresponding author and is subject to approval and an appropriate access agreement. A browser-based WebGL build of the digital twin is available at https://souhilsid.github.io/Self-Driving-Lab-Digital-Twin-/, with the downloadable build folder archived at https://github.com/souhilsid/Self-Driving-Lab-Digital-Twin-/tree/main/digital_twin_sdl_build.</w:t>
       </w:r>
     </w:p>
     <w:p>
@@ -5948,7 +5948,7 @@
                 <w:b w:val="0"/>
                 <w:sz w:val="17"/>
               </w:rPr>
-              <w:t>CEID access request</w:t>
+              <w:t>Downloadable WebGL build folder</w:t>
             </w:r>
           </w:p>
         </w:tc>
@@ -5969,7 +5969,7 @@
                 <w:b w:val="0"/>
                 <w:sz w:val="17"/>
               </w:rPr>
-              <w:t>[INSERT CONTACT EMAIL OR REQUEST URL]</w:t>
+              <w:t>https://github.com/souhilsid/Self-Driving-Lab-Digital-Twin-/tree/main/digital_twin_sdl_build</w:t>
             </w:r>
           </w:p>
         </w:tc>
@@ -5991,7 +5991,7 @@
                 <w:b w:val="0"/>
                 <w:sz w:val="17"/>
               </w:rPr>
-              <w:t>Hardware access request</w:t>
+              <w:t>CEID access request</w:t>
             </w:r>
           </w:p>
         </w:tc>
@@ -5999,6 +5999,50 @@
           <w:tcPr>
             <w:tcW w:type="dxa" w:w="4968"/>
             <w:vAlign w:val="center"/>
+          </w:tcPr>
+          <w:p>
+            <w:pPr>
+              <w:jc w:val="center"/>
+            </w:pPr>
+            <w:r/>
+            <w:r>
+              <w:rPr>
+                <w:rFonts w:ascii="Arial" w:hAnsi="Arial"/>
+                <w:b w:val="0"/>
+                <w:sz w:val="17"/>
+              </w:rPr>
+              <w:t>[INSERT CONTACT EMAIL OR REQUEST URL]</w:t>
+            </w:r>
+          </w:p>
+        </w:tc>
+      </w:tr>
+      <w:tr>
+        <w:tc>
+          <w:tcPr>
+            <w:tcW w:type="dxa" w:w="4968"/>
+            <w:vAlign w:val="center"/>
+            <w:shd w:fill="F4F7FA"/>
+          </w:tcPr>
+          <w:p>
+            <w:pPr>
+              <w:jc w:val="center"/>
+            </w:pPr>
+            <w:r/>
+            <w:r>
+              <w:rPr>
+                <w:rFonts w:ascii="Arial" w:hAnsi="Arial"/>
+                <w:b w:val="0"/>
+                <w:sz w:val="17"/>
+              </w:rPr>
+              <w:t>Hardware access request</w:t>
+            </w:r>
+          </w:p>
+        </w:tc>
+        <w:tc>
+          <w:tcPr>
+            <w:tcW w:type="dxa" w:w="4968"/>
+            <w:vAlign w:val="center"/>
+            <w:shd w:fill="F4F7FA"/>
           </w:tcPr>
           <w:p>
             <w:pPr>
@@ -6059,7 +6103,7 @@
     </w:p>
     <w:p>
       <w:r>
-        <w:t>A reviewer-accessible binary of the digital twin is available as a browser-based WebGL build at https://souhilsid.github.io/Self-Driving-Lab-Digital-Twin-/. No installation or access code is required. Reviewers can open the URL in a WebGL-compatible desktop browser. The demonstration includes the digital-twin interface and a representative closed-loop workflow but does not provide unrestricted access to the proprietary CEID service or physical robotic hardware. Requests for supervised access to those components may be directed to [CONTACT EMAIL].</w:t>
+        <w:t>A reviewer-accessible binary of the digital twin is available as a browser-based WebGL build at https://souhilsid.github.io/Self-Driving-Lab-Digital-Twin-/. No installation or access code is required. Reviewers can open the URL in a WebGL-compatible desktop browser. The corresponding Unity WebGL build folder is archived at https://github.com/souhilsid/Self-Driving-Lab-Digital-Twin-/tree/main/digital_twin_sdl_build. The demonstration includes the digital-twin interface and a representative closed-loop workflow but does not provide unrestricted access to the proprietary CEID service or physical robotic hardware. Requests for supervised access to those components may be directed to [CONTACT EMAIL].</w:t>
       </w:r>
     </w:p>
     <w:p>

</xml_diff>